<commit_message>
change mat and overview list
</commit_message>
<xml_diff>
--- a/list_templates/mat.docx
+++ b/list_templates/mat.docx
@@ -64,15 +64,15 @@
     <w:tbl>
       <w:tblPr>
         <w:tblStyle w:val="Gitternetztabelle4Akzent3"/>
-        <w:tblW w:w="7763" w:type="dxa"/>
+        <w:tblW w:w="8653" w:type="dxa"/>
         <w:tblLook w:val="04A0" w:firstRow="1" w:lastRow="0" w:firstColumn="1" w:lastColumn="0" w:noHBand="0" w:noVBand="1"/>
       </w:tblPr>
       <w:tblGrid>
         <w:gridCol w:w="1003"/>
+        <w:gridCol w:w="1003"/>
         <w:gridCol w:w="977"/>
-        <w:gridCol w:w="2268"/>
-        <w:gridCol w:w="2268"/>
-        <w:gridCol w:w="1247"/>
+        <w:gridCol w:w="2835"/>
+        <w:gridCol w:w="2835"/>
       </w:tblGrid>
       <w:tr>
         <w:trPr>
@@ -102,7 +102,35 @@
                 <w:szCs w:val="18"/>
                 <w:lang w:eastAsia="de-DE"/>
               </w:rPr>
-              <w:t>Anwesend</w:t>
+              <w:t>#</w:t>
+            </w:r>
+          </w:p>
+        </w:tc>
+        <w:tc>
+          <w:tcPr>
+            <w:tcW w:w="1003" w:type="dxa"/>
+          </w:tcPr>
+          <w:p>
+            <w:pPr>
+              <w:jc w:val="center"/>
+              <w:cnfStyle w:val="100000000000" w:firstRow="1" w:lastRow="0" w:firstColumn="0" w:lastColumn="0" w:oddVBand="0" w:evenVBand="0" w:oddHBand="0" w:evenHBand="0" w:firstRowFirstColumn="0" w:firstRowLastColumn="0" w:lastRowFirstColumn="0" w:lastRowLastColumn="0"/>
+              <w:rPr>
+                <w:rFonts w:eastAsia="Times New Roman" w:cstheme="minorHAnsi"/>
+                <w:color w:val="000000"/>
+                <w:sz w:val="18"/>
+                <w:szCs w:val="18"/>
+                <w:lang w:eastAsia="de-DE"/>
+              </w:rPr>
+            </w:pPr>
+            <w:r>
+              <w:rPr>
+                <w:rFonts w:eastAsia="Times New Roman" w:cstheme="minorHAnsi"/>
+                <w:color w:val="000000"/>
+                <w:sz w:val="18"/>
+                <w:szCs w:val="18"/>
+                <w:lang w:eastAsia="de-DE"/>
+              </w:rPr>
+              <w:t>Gekauft</w:t>
             </w:r>
           </w:p>
         </w:tc>
@@ -138,7 +166,7 @@
         </w:tc>
         <w:tc>
           <w:tcPr>
-            <w:tcW w:w="2268" w:type="dxa"/>
+            <w:tcW w:w="2835" w:type="dxa"/>
             <w:hideMark/>
           </w:tcPr>
           <w:p>
@@ -165,7 +193,7 @@
         </w:tc>
         <w:tc>
           <w:tcPr>
-            <w:tcW w:w="2268" w:type="dxa"/>
+            <w:tcW w:w="2835" w:type="dxa"/>
             <w:hideMark/>
           </w:tcPr>
           <w:p>
@@ -187,33 +215,6 @@
                 <w:lang w:eastAsia="de-DE"/>
               </w:rPr>
               <w:t xml:space="preserve">Vorname </w:t>
-            </w:r>
-          </w:p>
-        </w:tc>
-        <w:tc>
-          <w:tcPr>
-            <w:tcW w:w="1247" w:type="dxa"/>
-            <w:hideMark/>
-          </w:tcPr>
-          <w:p>
-            <w:pPr>
-              <w:cnfStyle w:val="100000000000" w:firstRow="1" w:lastRow="0" w:firstColumn="0" w:lastColumn="0" w:oddVBand="0" w:evenVBand="0" w:oddHBand="0" w:evenHBand="0" w:firstRowFirstColumn="0" w:firstRowLastColumn="0" w:lastRowFirstColumn="0" w:lastRowLastColumn="0"/>
-              <w:rPr>
-                <w:rFonts w:eastAsia="Times New Roman" w:cstheme="minorHAnsi"/>
-                <w:sz w:val="18"/>
-                <w:szCs w:val="18"/>
-                <w:lang w:eastAsia="de-DE"/>
-              </w:rPr>
-            </w:pPr>
-            <w:r>
-              <w:rPr>
-                <w:rFonts w:eastAsia="Times New Roman" w:cstheme="minorHAnsi"/>
-                <w:color w:val="000000"/>
-                <w:sz w:val="18"/>
-                <w:szCs w:val="18"/>
-                <w:lang w:eastAsia="de-DE"/>
-              </w:rPr>
-              <w:t>Nummer</w:t>
             </w:r>
           </w:p>
         </w:tc>
@@ -233,6 +234,82 @@
               <w:outlineLvl w:val="1"/>
               <w:rPr>
                 <w:rFonts w:ascii="Segoe UI Symbol" w:eastAsia="Times New Roman" w:hAnsi="Segoe UI Symbol" w:cs="Segoe UI Symbol"/>
+                <w:b w:val="0"/>
+                <w:bCs w:val="0"/>
+                <w:sz w:val="24"/>
+                <w:szCs w:val="24"/>
+                <w:lang w:eastAsia="de-DE"/>
+              </w:rPr>
+            </w:pPr>
+            <w:r>
+              <w:rPr>
+                <w:rFonts w:ascii="Segoe UI Symbol" w:eastAsia="Times New Roman" w:hAnsi="Segoe UI Symbol" w:cs="Segoe UI Symbol"/>
+                <w:b w:val="0"/>
+                <w:bCs w:val="0"/>
+                <w:sz w:val="24"/>
+                <w:szCs w:val="24"/>
+                <w:lang w:eastAsia="de-DE"/>
+              </w:rPr>
+              <w:fldChar w:fldCharType="begin"/>
+            </w:r>
+            <w:r>
+              <w:rPr>
+                <w:rFonts w:ascii="Segoe UI Symbol" w:eastAsia="Times New Roman" w:hAnsi="Segoe UI Symbol" w:cs="Segoe UI Symbol"/>
+                <w:b w:val="0"/>
+                <w:bCs w:val="0"/>
+                <w:sz w:val="24"/>
+                <w:szCs w:val="24"/>
+                <w:lang w:eastAsia="de-DE"/>
+              </w:rPr>
+              <w:instrText xml:space="preserve"> MERGEFIELD  num  \* MERGEFORMAT </w:instrText>
+            </w:r>
+            <w:r>
+              <w:rPr>
+                <w:rFonts w:ascii="Segoe UI Symbol" w:eastAsia="Times New Roman" w:hAnsi="Segoe UI Symbol" w:cs="Segoe UI Symbol"/>
+                <w:b w:val="0"/>
+                <w:bCs w:val="0"/>
+                <w:sz w:val="24"/>
+                <w:szCs w:val="24"/>
+                <w:lang w:eastAsia="de-DE"/>
+              </w:rPr>
+              <w:fldChar w:fldCharType="separate"/>
+            </w:r>
+            <w:r>
+              <w:rPr>
+                <w:rFonts w:ascii="Segoe UI Symbol" w:eastAsia="Times New Roman" w:hAnsi="Segoe UI Symbol" w:cs="Segoe UI Symbol"/>
+                <w:b w:val="0"/>
+                <w:bCs w:val="0"/>
+                <w:noProof/>
+                <w:sz w:val="24"/>
+                <w:szCs w:val="24"/>
+                <w:lang w:eastAsia="de-DE"/>
+              </w:rPr>
+              <w:t>«num»</w:t>
+            </w:r>
+            <w:r>
+              <w:rPr>
+                <w:rFonts w:ascii="Segoe UI Symbol" w:eastAsia="Times New Roman" w:hAnsi="Segoe UI Symbol" w:cs="Segoe UI Symbol"/>
+                <w:b w:val="0"/>
+                <w:bCs w:val="0"/>
+                <w:sz w:val="24"/>
+                <w:szCs w:val="24"/>
+                <w:lang w:eastAsia="de-DE"/>
+              </w:rPr>
+              <w:fldChar w:fldCharType="end"/>
+            </w:r>
+          </w:p>
+        </w:tc>
+        <w:tc>
+          <w:tcPr>
+            <w:tcW w:w="1003" w:type="dxa"/>
+          </w:tcPr>
+          <w:p>
+            <w:pPr>
+              <w:jc w:val="center"/>
+              <w:outlineLvl w:val="1"/>
+              <w:cnfStyle w:val="000000100000" w:firstRow="0" w:lastRow="0" w:firstColumn="0" w:lastColumn="0" w:oddVBand="0" w:evenVBand="0" w:oddHBand="1" w:evenHBand="0" w:firstRowFirstColumn="0" w:firstRowLastColumn="0" w:lastRowFirstColumn="0" w:lastRowLastColumn="0"/>
+              <w:rPr>
+                <w:rFonts w:ascii="Segoe UI Symbol" w:eastAsia="Times New Roman" w:hAnsi="Segoe UI Symbol" w:cs="Segoe UI Symbol"/>
                 <w:sz w:val="24"/>
                 <w:szCs w:val="24"/>
                 <w:lang w:eastAsia="de-DE"/>
@@ -314,7 +391,7 @@
         </w:tc>
         <w:tc>
           <w:tcPr>
-            <w:tcW w:w="2268" w:type="dxa"/>
+            <w:tcW w:w="2835" w:type="dxa"/>
             <w:hideMark/>
           </w:tcPr>
           <w:p>
@@ -377,7 +454,7 @@
         </w:tc>
         <w:tc>
           <w:tcPr>
-            <w:tcW w:w="2268" w:type="dxa"/>
+            <w:tcW w:w="2835" w:type="dxa"/>
           </w:tcPr>
           <w:p>
             <w:pPr>
@@ -435,22 +512,6 @@
               </w:rPr>
               <w:fldChar w:fldCharType="end"/>
             </w:r>
-          </w:p>
-        </w:tc>
-        <w:tc>
-          <w:tcPr>
-            <w:tcW w:w="1247" w:type="dxa"/>
-          </w:tcPr>
-          <w:p>
-            <w:pPr>
-              <w:cnfStyle w:val="000000100000" w:firstRow="0" w:lastRow="0" w:firstColumn="0" w:lastColumn="0" w:oddVBand="0" w:evenVBand="0" w:oddHBand="1" w:evenHBand="0" w:firstRowFirstColumn="0" w:firstRowLastColumn="0" w:lastRowFirstColumn="0" w:lastRowLastColumn="0"/>
-              <w:rPr>
-                <w:rFonts w:eastAsia="Times New Roman" w:cstheme="minorHAnsi"/>
-                <w:sz w:val="24"/>
-                <w:szCs w:val="24"/>
-                <w:lang w:eastAsia="de-DE"/>
-              </w:rPr>
-            </w:pPr>
           </w:p>
         </w:tc>
       </w:tr>

</xml_diff>